<commit_message>
docs: orientador Prof. Me. Davi Lazer Grave Teixeira de Andrade
Corrige o nome do orientador no Projeto Integrador, no artigo e na versao ABNT.

Co-Authored-By: Claude Opus 5.5 <noreply@anthropic.com>
Claude-Session: https://claude.ai/code/session_011SKCdnRmci1yJCi4ZvMpS2
</commit_message>
<xml_diff>
--- a/docs/Artigo-Projeto-Integrador.docx
+++ b/docs/Artigo-Projeto-Integrador.docx
@@ -177,7 +177,7 @@
           <w:sz w:val="24"/>
           <w:szCs w:val="24"/>
         </w:rPr>
-        <w:t>MURAKAMI, Rafael Guem</w:t>
+        <w:t>ANDRADE, Davi Lazer Grave Teixeira de</w:t>
       </w:r>
       <w:r>
         <w:rPr>
@@ -2174,7 +2174,7 @@
           <w:sz w:val="20"/>
           <w:szCs w:val="20"/>
         </w:rPr>
-        <w:t>Professor orientador, Universidade Santo Amaro – SP.</w:t>
+        <w:t>Professor orientador: Mestre, Universidade Santo Amaro – SP.</w:t>
       </w:r>
     </w:p>
   </w:footnote>

</xml_diff>